<commit_message>
Nuevos cambios a documento de GitHub
</commit_message>
<xml_diff>
--- a/documentacion/GitHub.docx
+++ b/documentacion/GitHub.docx
@@ -9,15 +9,7 @@
     </w:p>
     <w:p>
       <w:r>
-        <w:t xml:space="preserve">Con la cuenta ya configurada se crea un nuevo repositorio y se </w:t>
-      </w:r>
-      <w:proofErr w:type="gramStart"/>
-      <w:r>
-        <w:t>le</w:t>
-      </w:r>
-      <w:proofErr w:type="gramEnd"/>
-      <w:r>
-        <w:t xml:space="preserve"> da </w:t>
+        <w:t xml:space="preserve">Con la cuenta ya configurada se crea un nuevo repositorio y da </w:t>
       </w:r>
       <w:r>
         <w:t>acceso a</w:t>
@@ -29,6 +21,9 @@
         <w:br/>
       </w:r>
       <w:r>
+        <w:rPr>
+          <w:noProof/>
+        </w:rPr>
         <w:drawing>
           <wp:inline distT="0" distB="0" distL="0" distR="0" wp14:anchorId="67BEE626" wp14:editId="31515461">
             <wp:extent cx="5612130" cy="658495"/>
@@ -76,6 +71,9 @@
         <w:br/>
       </w:r>
       <w:r>
+        <w:rPr>
+          <w:noProof/>
+        </w:rPr>
         <w:drawing>
           <wp:inline distT="0" distB="0" distL="0" distR="0" wp14:anchorId="7AFE62BB" wp14:editId="19545E3A">
             <wp:extent cx="5612130" cy="4819015"/>
@@ -123,16 +121,11 @@
         <w:lastRenderedPageBreak/>
         <w:t xml:space="preserve">Se toma nota de la </w:t>
       </w:r>
-      <w:proofErr w:type="spellStart"/>
       <w:r>
         <w:t>U</w:t>
       </w:r>
       <w:r>
-        <w:t>rl</w:t>
-      </w:r>
-      <w:proofErr w:type="spellEnd"/>
-      <w:r>
-        <w:t xml:space="preserve"> que nos crea </w:t>
+        <w:t xml:space="preserve">rl que nos crea </w:t>
       </w:r>
       <w:r>
         <w:t>GitHub</w:t>
@@ -153,6 +146,9 @@
         <w:br/>
       </w:r>
       <w:r>
+        <w:rPr>
+          <w:noProof/>
+        </w:rPr>
         <w:drawing>
           <wp:inline distT="0" distB="0" distL="0" distR="0" wp14:anchorId="3D2411E1" wp14:editId="4242287D">
             <wp:extent cx="5612130" cy="481965"/>
@@ -193,20 +189,15 @@
     <w:p>
       <w:r>
         <w:br/>
-        <w:t xml:space="preserve">Se les da el acceso a los colaboradores del </w:t>
-      </w:r>
-      <w:proofErr w:type="spellStart"/>
-      <w:r>
-        <w:t>pryecto</w:t>
-      </w:r>
-      <w:proofErr w:type="spellEnd"/>
-      <w:r>
-        <w:t>.</w:t>
+        <w:t>Se les da el acceso a los colaboradores del pryecto.</w:t>
       </w:r>
       <w:r>
         <w:br/>
       </w:r>
       <w:r>
+        <w:rPr>
+          <w:noProof/>
+        </w:rPr>
         <w:drawing>
           <wp:inline distT="0" distB="0" distL="0" distR="0" wp14:anchorId="6B360D0D" wp14:editId="721C0241">
             <wp:extent cx="5612130" cy="2766060"/>
@@ -256,6 +247,9 @@
         <w:br/>
       </w:r>
       <w:r>
+        <w:rPr>
+          <w:noProof/>
+        </w:rPr>
         <w:drawing>
           <wp:inline distT="0" distB="0" distL="0" distR="0" wp14:anchorId="6EA74A5B" wp14:editId="6D677D36">
             <wp:extent cx="5612130" cy="3154680"/>
@@ -307,6 +301,9 @@
     </w:p>
     <w:p>
       <w:r>
+        <w:rPr>
+          <w:noProof/>
+        </w:rPr>
         <w:drawing>
           <wp:inline distT="0" distB="0" distL="0" distR="0" wp14:anchorId="77EE9C12" wp14:editId="6365495A">
             <wp:extent cx="5612130" cy="1013460"/>
@@ -346,19 +343,14 @@
     </w:p>
     <w:p>
       <w:r>
-        <w:t xml:space="preserve">Agregamos los archivos y creamos nuestro </w:t>
-      </w:r>
-      <w:proofErr w:type="spellStart"/>
-      <w:r>
-        <w:t>commit</w:t>
-      </w:r>
-      <w:proofErr w:type="spellEnd"/>
-      <w:r>
-        <w:t xml:space="preserve"> inicial</w:t>
-      </w:r>
-    </w:p>
-    <w:p>
-      <w:r>
+        <w:t>Agregamos los archivos y creamos nuestro commit inicial</w:t>
+      </w:r>
+    </w:p>
+    <w:p>
+      <w:r>
+        <w:rPr>
+          <w:noProof/>
+        </w:rPr>
         <w:drawing>
           <wp:inline distT="0" distB="0" distL="0" distR="0" wp14:anchorId="0E494ED2" wp14:editId="301F303B">
             <wp:extent cx="5612130" cy="1372235"/>
@@ -402,6 +394,9 @@
         <w:t>Enlazamos nuestro repositorio de GitHub con la dirección que anteriormente nos genero</w:t>
       </w:r>
       <w:r>
+        <w:rPr>
+          <w:noProof/>
+        </w:rPr>
         <w:drawing>
           <wp:inline distT="0" distB="0" distL="0" distR="0" wp14:anchorId="6D554BD5" wp14:editId="6AD0C160">
             <wp:extent cx="5612130" cy="1217930"/>
@@ -446,6 +441,9 @@
     </w:p>
     <w:p>
       <w:r>
+        <w:rPr>
+          <w:noProof/>
+        </w:rPr>
         <w:drawing>
           <wp:inline distT="0" distB="0" distL="0" distR="0" wp14:anchorId="7A0E5AED" wp14:editId="13C32D16">
             <wp:extent cx="5449060" cy="1914792"/>
@@ -486,19 +484,14 @@
     <w:p/>
     <w:p>
       <w:r>
-        <w:t xml:space="preserve">Usando </w:t>
-      </w:r>
-      <w:proofErr w:type="spellStart"/>
-      <w:r>
-        <w:t>VSCode</w:t>
-      </w:r>
-      <w:proofErr w:type="spellEnd"/>
-      <w:r>
-        <w:t>, abrimos nuestra carpeta local</w:t>
-      </w:r>
-    </w:p>
-    <w:p>
-      <w:r>
+        <w:t>Usando VSCode, abrimos nuestra carpeta local</w:t>
+      </w:r>
+    </w:p>
+    <w:p>
+      <w:r>
+        <w:rPr>
+          <w:noProof/>
+        </w:rPr>
         <w:lastRenderedPageBreak/>
         <w:drawing>
           <wp:inline distT="0" distB="0" distL="0" distR="0" wp14:anchorId="1FC3554C" wp14:editId="2EB145B9">
@@ -545,6 +538,9 @@
         <w:br/>
       </w:r>
       <w:r>
+        <w:rPr>
+          <w:noProof/>
+        </w:rPr>
         <w:drawing>
           <wp:inline distT="0" distB="0" distL="0" distR="0" wp14:anchorId="22194B19" wp14:editId="7D7C99D4">
             <wp:extent cx="5612130" cy="1315085"/>
@@ -586,23 +582,7 @@
       </w:r>
       <w:r>
         <w:br/>
-        <w:t xml:space="preserve">Estando en la rama que se ha creado, se ha agregado un documento que será parte de la documentación del entregable, realizamos un </w:t>
-      </w:r>
-      <w:proofErr w:type="spellStart"/>
-      <w:r>
-        <w:t>commit</w:t>
-      </w:r>
-      <w:proofErr w:type="spellEnd"/>
-      <w:r>
-        <w:t xml:space="preserve"> y </w:t>
-      </w:r>
-      <w:proofErr w:type="spellStart"/>
-      <w:r>
-        <w:t>push</w:t>
-      </w:r>
-      <w:proofErr w:type="spellEnd"/>
-      <w:r>
-        <w:t xml:space="preserve"> siempre agregando un </w:t>
+        <w:t xml:space="preserve">Estando en la rama que se ha creado, se ha agregado un documento que será parte de la documentación del entregable, realizamos un commit y push siempre agregando un </w:t>
       </w:r>
       <w:proofErr w:type="gramStart"/>
       <w:r>
@@ -620,6 +600,9 @@
         <w:br/>
       </w:r>
       <w:r>
+        <w:rPr>
+          <w:noProof/>
+        </w:rPr>
         <w:drawing>
           <wp:inline distT="0" distB="0" distL="0" distR="0" wp14:anchorId="61A77BD5" wp14:editId="5B5E63D0">
             <wp:extent cx="5612130" cy="3135630"/>
@@ -660,28 +643,15 @@
     <w:p/>
     <w:p>
       <w:r>
-        <w:t xml:space="preserve">Al haber creado la rama desde </w:t>
-      </w:r>
-      <w:proofErr w:type="spellStart"/>
-      <w:r>
-        <w:t>VSCode</w:t>
-      </w:r>
-      <w:proofErr w:type="spellEnd"/>
-      <w:r>
-        <w:t xml:space="preserve"> nos indica que la rama no </w:t>
-      </w:r>
-      <w:proofErr w:type="spellStart"/>
-      <w:r>
-        <w:t>esta</w:t>
-      </w:r>
-      <w:proofErr w:type="spellEnd"/>
-      <w:r>
-        <w:t xml:space="preserve"> publicada en el repositorio remoto, damos en OK para que proceda a publicarla. </w:t>
+        <w:t xml:space="preserve">Al haber creado la rama desde VSCode nos indica que la rama no esta publicada en el repositorio remoto, damos en OK para que proceda a publicarla. </w:t>
       </w:r>
       <w:r>
         <w:br/>
       </w:r>
       <w:r>
+        <w:rPr>
+          <w:noProof/>
+        </w:rPr>
         <w:drawing>
           <wp:inline distT="0" distB="0" distL="0" distR="0" wp14:anchorId="4860C5F8" wp14:editId="6FF7ADD8">
             <wp:extent cx="5612130" cy="1708150"/>
@@ -723,27 +693,14 @@
       </w:r>
       <w:r>
         <w:br/>
-        <w:t xml:space="preserve">En nuestra pagina de GitHub nos indica que se a creado una solicitud de </w:t>
-      </w:r>
-      <w:proofErr w:type="spellStart"/>
-      <w:r>
-        <w:t>pull</w:t>
-      </w:r>
-      <w:proofErr w:type="spellEnd"/>
-      <w:r>
-        <w:t xml:space="preserve"> </w:t>
-      </w:r>
-      <w:proofErr w:type="spellStart"/>
-      <w:r>
-        <w:t>request</w:t>
-      </w:r>
-      <w:proofErr w:type="spellEnd"/>
-      <w:r>
-        <w:t xml:space="preserve"> </w:t>
-      </w:r>
-    </w:p>
-    <w:p>
-      <w:r>
+        <w:t xml:space="preserve">En nuestra pagina de GitHub nos indica que se a creado una solicitud de pull request </w:t>
+      </w:r>
+    </w:p>
+    <w:p>
+      <w:r>
+        <w:rPr>
+          <w:noProof/>
+        </w:rPr>
         <w:drawing>
           <wp:inline distT="0" distB="0" distL="0" distR="0" wp14:anchorId="01B44176" wp14:editId="70537AF1">
             <wp:extent cx="5612130" cy="1617345"/>
@@ -783,16 +740,14 @@
     </w:p>
     <w:p>
       <w:r>
-        <w:t xml:space="preserve">Creamos la Pull </w:t>
-      </w:r>
-      <w:proofErr w:type="spellStart"/>
-      <w:r>
-        <w:t>request</w:t>
-      </w:r>
-      <w:proofErr w:type="spellEnd"/>
-    </w:p>
-    <w:p>
-      <w:r>
+        <w:t>Creamos la Pull request</w:t>
+      </w:r>
+    </w:p>
+    <w:p>
+      <w:r>
+        <w:rPr>
+          <w:noProof/>
+        </w:rPr>
         <w:lastRenderedPageBreak/>
         <w:drawing>
           <wp:inline distT="0" distB="0" distL="0" distR="0" wp14:anchorId="775A1A0C" wp14:editId="7559C35C">
@@ -844,16 +799,14 @@
       </w:r>
       <w:proofErr w:type="gramEnd"/>
       <w:r>
-        <w:t xml:space="preserve"> y verificar que no existe conflicto se procede con el </w:t>
-      </w:r>
-      <w:proofErr w:type="spellStart"/>
-      <w:r>
-        <w:t>Merge</w:t>
-      </w:r>
-      <w:proofErr w:type="spellEnd"/>
-    </w:p>
-    <w:p>
-      <w:r>
+        <w:t xml:space="preserve"> y verificar que no existe conflicto se procede con el Merge</w:t>
+      </w:r>
+    </w:p>
+    <w:p>
+      <w:r>
+        <w:rPr>
+          <w:noProof/>
+        </w:rPr>
         <w:drawing>
           <wp:inline distT="0" distB="0" distL="0" distR="0" wp14:anchorId="6555B61C" wp14:editId="0C7D5A7E">
             <wp:extent cx="5612130" cy="4001135"/>
@@ -904,6 +857,9 @@
         <w:br/>
       </w:r>
       <w:r>
+        <w:rPr>
+          <w:noProof/>
+        </w:rPr>
         <w:drawing>
           <wp:inline distT="0" distB="0" distL="0" distR="0" wp14:anchorId="06268339" wp14:editId="08CA9C50">
             <wp:extent cx="5612130" cy="800100"/>
@@ -950,6 +906,9 @@
     <w:p/>
     <w:p>
       <w:r>
+        <w:rPr>
+          <w:noProof/>
+        </w:rPr>
         <w:drawing>
           <wp:inline distT="0" distB="0" distL="0" distR="0" wp14:anchorId="67E9F467" wp14:editId="616058B8">
             <wp:extent cx="5612130" cy="1012190"/>

</xml_diff>